<commit_message>
Updated final project report.
</commit_message>
<xml_diff>
--- a/Final-Project-Report-Credit-Risk-Team-2.docx
+++ b/Final-Project-Report-Credit-Risk-Team-2.docx
@@ -2406,14 +2406,7 @@
           <w:color w:val="000000"/>
           <w:shd w:val="clear" w:color="auto" w:fill="FFFFFF"/>
         </w:rPr>
-        <w:t>dataset comprises 32 thousand 581 records across 12 distinct variables</w:t>
-      </w:r>
-      <w:r>
-        <w:rPr>
-          <w:color w:val="000000"/>
-          <w:shd w:val="clear" w:color="auto" w:fill="FFFFFF"/>
-        </w:rPr>
-        <w:t>.</w:t>
+        <w:t>dataset comprises 32 thousand 581 records across 12 distinct variables.</w:t>
       </w:r>
       <w:r>
         <w:t xml:space="preserve"> A summary of key descriptive statistics is shown in Table 2.</w:t>
@@ -6336,7 +6329,7 @@
         <w:spacing w:after="120" w:line="360" w:lineRule="auto"/>
       </w:pPr>
       <w:r>
-        <w:t>Full 9×9 Pearson correlation heatmap (coolwarm color scheme, range −1 to +1)</w:t>
+        <w:t>Pearson correlation heatmap (coolwarm color scheme, range −1 to +1)</w:t>
       </w:r>
     </w:p>
     <w:p>

</xml_diff>